<commit_message>
Update paper and slides with Phase 2 Whisper FT results
- Paper: add section 3.4 (Whisper FT), update abstract/discussion/conclusion
- Slides: add s22 (approach comparison), s23 (FT results), total 27 slides
- Key result: CER 0.269 → 0.095 (64.6% improvement)

Co-Authored-By: Claude Sonnet 4.6 <noreply@anthropic.com>
</commit_message>
<xml_diff>
--- a/results/paper_asj_final.docx
+++ b/results/paper_asj_final.docx
@@ -71,7 +71,7 @@
         <w:rPr>
           <w:sz w:val="18"/>
         </w:rPr>
-        <w:t>骨伝導マイク（喉マイク）は高騒音環境での音声収音に有用だが，低域偏重・高周波欠落という独特の周波数特性を持ち，一般的なASRシステムでは高い文字誤り率（CER）が生じる．本研究では，DSPベースおよびGTCRNニューラルSEを喉マイク音声に適用し，Whisperを用いたCERへの影響をSTOI・PESQとあわせて34条件で定量評価した．全ノイズ条件においてSE適用後のCERが有意に悪化し（Wilcoxon検定，30検定中26件 p&lt;0.05），GTCRNはSTOIおよびPESQを改善しながらCERを悪化させるという知覚品質とASR性能の乖離を示した．</w:t>
+        <w:t>骨伝導マイク（喉マイク）は高騒音環境での音声収音に有用だが，低域偏重・高周波欠落という独特の周波数特性を持ち，一般的なASRシステムでは高い文字誤り率（CER）が生じる．本研究では，DSPベースおよびGTCRNニューラルSEを喉マイク音声に適用し，Whisperを用いたCERへの影響をSTOI・PESQとあわせて34条件で定量評価した．全ノイズ条件においてSE適用後のCERが有意に悪化し（Wilcoxon検定，30検定中26件 p&lt;0.05），GTCRNはSTOIおよびPESQを改善しながらCERを悪化させるという知覚品質とASR性能の乖離を示した．さらに，Whisper smallをTAPSの喉マイク音声でファインチューニングすることでCERが0.269から0.095へと64.6%改善することを確認した．</w:t>
       </w:r>
     </w:p>
     <w:p>
@@ -527,6 +527,100 @@
     </w:p>
     <w:p>
       <w:pPr>
+        <w:spacing w:before="80" w:after="20"/>
+        <w:jc w:val="left"/>
+      </w:pPr>
+      <w:r>
+        <w:rPr>
+          <w:b/>
+          <w:sz w:val="20"/>
+        </w:rPr>
+        <w:t>3.4　Whisperファインチューニングの効果</w:t>
+      </w:r>
+    </w:p>
+    <w:p>
+      <w:pPr>
+        <w:spacing w:before="0" w:after="60"/>
+        <w:ind w:firstLine="283"/>
+        <w:jc w:val="both"/>
+      </w:pPr>
+      <w:r>
+        <w:rPr>
+          <w:b w:val="0"/>
+          <w:sz w:val="20"/>
+        </w:rPr>
+        <w:t>SEによる音声変換ではなく，ASRモデル自体を喉マイクに適応させるアプローチとして，Whisper smallをTAPSのtrain split（40話者・4,000発話・10.2時間）を用いてファインチューニングした．学習設定はepochs=20（early stopping，best at epoch 3），batch_size=16，lr=1e-5，warmup_steps=500，fp16=Trueである．</w:t>
+      </w:r>
+    </w:p>
+    <w:p>
+      <w:pPr>
+        <w:spacing w:before="0" w:after="60"/>
+        <w:ind w:firstLine="283"/>
+        <w:jc w:val="both"/>
+      </w:pPr>
+      <w:r>
+        <w:rPr>
+          <w:b w:val="0"/>
+          <w:sz w:val="20"/>
+        </w:rPr>
+        <w:t>表2にテストセット（話者p00，50発話）における結果を示す．ファインチューニング後のCERは0.095であり，未学習時（0.269）から64.6%の改善が得られた．これはSE適用時のCER悪化とは対照的な結果であり，喉マイクASRの改善には音声処理よりもドメイン適応型ASR学習が有効であることを示す．</w:t>
+      </w:r>
+    </w:p>
+    <w:p>
+      <w:pPr>
+        <w:spacing w:before="60" w:after="0"/>
+        <w:jc w:val="center"/>
+      </w:pPr>
+      <w:r>
+        <w:drawing>
+          <wp:inline xmlns:a="http://schemas.openxmlformats.org/drawingml/2006/main" xmlns:pic="http://schemas.openxmlformats.org/drawingml/2006/picture">
+            <wp:extent cx="2700000" cy="1198842"/>
+            <wp:docPr id="4" name="Picture 4"/>
+            <wp:cNvGraphicFramePr>
+              <a:graphicFrameLocks noChangeAspect="1"/>
+            </wp:cNvGraphicFramePr>
+            <a:graphic>
+              <a:graphicData uri="http://schemas.openxmlformats.org/drawingml/2006/picture">
+                <pic:pic>
+                  <pic:nvPicPr>
+                    <pic:cNvPr id="0" name="image.png"/>
+                    <pic:cNvPicPr/>
+                  </pic:nvPicPr>
+                  <pic:blipFill>
+                    <a:blip r:embed="rId14"/>
+                    <a:stretch>
+                      <a:fillRect/>
+                    </a:stretch>
+                  </pic:blipFill>
+                  <pic:spPr>
+                    <a:xfrm>
+                      <a:off x="0" y="0"/>
+                      <a:ext cx="2700000" cy="1198842"/>
+                    </a:xfrm>
+                    <a:prstGeom prst="rect"/>
+                  </pic:spPr>
+                </pic:pic>
+              </a:graphicData>
+            </a:graphic>
+          </wp:inline>
+        </w:drawing>
+      </w:r>
+    </w:p>
+    <w:p>
+      <w:pPr>
+        <w:spacing w:before="20" w:after="100"/>
+        <w:jc w:val="center"/>
+      </w:pPr>
+      <w:r>
+        <w:rPr>
+          <w:b/>
+          <w:sz w:val="18"/>
+        </w:rPr>
+        <w:t>表2　Whisperファインチューニングの効果（テストセット話者p00）</w:t>
+      </w:r>
+    </w:p>
+    <w:p>
+      <w:pPr>
         <w:spacing w:before="100" w:after="40"/>
         <w:jc w:val="left"/>
       </w:pPr>
@@ -604,7 +698,7 @@
           <w:b w:val="0"/>
           <w:sz w:val="20"/>
         </w:rPr>
-        <w:t>喉マイク音声に対するSEの影響をCER・STOI・PESQの3指標で評価した結果，以下を明らかにした．（1）DSP-onlyおよびGTCRNは全ノイズ条件でCERを有意に悪化させる（30検定中26件，p&lt;0.05）．（2）GTCRNはSTOI・PESQを改善しながらCERを悪化させるという，知覚品質とASR性能の乖離が全ノイズ条件で一貫して観測される．（3）DSP-onlyは3指標すべてを悪化させ，喉マイクには不適切な前処理である．今後はWhisper large-v3による再評価および喉マイク専用学習済みSEモデルとの比較を行う予定である．</w:t>
+        <w:t>喉マイク音声に対するSEの影響と，ASRモデルのドメイン適応の効果をCER・STOI・PESQの3指標で評価した結果，以下を明らかにした．（1）DSP-onlyおよびGTCRNは全ノイズ条件でCERを有意に悪化させる（30検定中26件，p&lt;0.05）．（2）GTCRNはSTOI・PESQを改善しながらCERを悪化させるという，知覚品質とASR性能の乖離が全ノイズ条件で一貫して観測される．（3）DSP-onlyは3指標すべてを悪化させ，喉マイクには不適切な前処理である．（4）Whisper smallを喉マイク音声でファインチューニングすることでCERが0.269から0.095へと64.6%改善し，ASRモデルのドメイン適応が音声処理より有効であることを示した．今後はWhisper large-v3でのファインチューニングや実環境ノイズへの適用可能性を検討する予定である．</w:t>
       </w:r>
     </w:p>
     <w:p>

</xml_diff>

<commit_message>
Update paper and slides with 2x2 results and improved literature positioning
- Add 2x2 comparison slide (s23b): FT×SE interaction showing SE harm shrinks after FT (+0.027→+0.007)
- Add conclusion point (5) summarizing 2x2 finding to slides summary
- Paper: add supplementary 2x2 paragraph in sec 3.4 and point (5) in conclusion
- Rewrite introduction to properly situate within broader SE→ASR paradox literature
  (Ochiai TASLP 2024, Mawalim Interspeech 2024, general noisy environments)
- Strengthen discussion: contrast domain-matched SE (SE-conformer CER 84.4→24.4%) vs
  domain-mismatched GTCRN (CER worsens) to support artifact error framework
- Update references: add TAPS paper (arXiv:2502.11478) and BAF-Net (Interspeech 2025)

Co-Authored-By: Claude Sonnet 4.6 <noreply@anthropic.com>
</commit_message>
<xml_diff>
--- a/results/paper_asj_final.docx
+++ b/results/paper_asj_final.docx
@@ -71,7 +71,7 @@
         <w:rPr>
           <w:sz w:val="18"/>
         </w:rPr>
-        <w:t>骨伝導マイク（喉マイク）は高騒音環境での音声収音に有用だが，低域偏重・高周波欠落という独特の周波数特性を持ち，一般的なASRシステムでは高い文字誤り率（CER）が生じる．本研究では，DSPベースおよびGTCRNニューラルSEを喉マイク音声に適用し，Whisperを用いたCERへの影響をSTOI・PESQとあわせて34条件で定量評価した．全ノイズ条件においてSE適用後のCERが有意に悪化し（Wilcoxon検定，30検定中26件 p&lt;0.05），GTCRNはSTOIおよびPESQを改善しながらCERを悪化させるという知覚品質とASR性能の乖離を示した．さらに，Whisper smallをTAPSの喉マイク音声でファインチューニングすることでCERが0.269から0.095へと64.6%改善することを確認した．</w:t>
+        <w:t>骨伝導マイク（喉マイク）は高騒音環境での音声収音に有用だが，低域偏重・高周波欠落という独特の周波数特性を持ち，一般的なASRシステムでは高い文字誤り率（CER）が生じる．SEがアーティファクト誤差を介してASRを悪化させることは一般ノイズ環境で報告されているが，喉マイクというドメイン外入力条件での系統的検証はなされていない．本研究では，DNS3学習済みGTCRN（ドメイン外SE）を喉マイク音声に適用し，Whisperを用いたCERへの影響をSTOI・PESQとあわせて34条件で定量評価した．全ノイズ条件においてSE後のCERが有意に悪化し（30検定中26件 p&lt;0.05），GTCRNはSTOI・PESQを改善しながらCERを悪化させる乖離が一貫して観測された．またWhisper smallのドメイン適応FTによりCERが0.269→0.095（64.6%改善）となり，FT後のSE悪化幅も+0.027から+0.007へ縮小した．</w:t>
       </w:r>
     </w:p>
     <w:p>
@@ -131,7 +131,7 @@
           <w:b w:val="0"/>
           <w:sz w:val="20"/>
         </w:rPr>
-        <w:t>音声強調（SE）はASR前処理として広く用いられるが，Mawalimら [1] は深層学習型SEが実環境ではASR性能を必ずしも改善しないことを示した．またOchiaiら [2] はSEが導入するアーティファクト誤差が残留ノイズよりもASRに有害であることを定量的に示している．しかし喉マイクという特殊なドメインでの検証はこれまでなされていない．</w:t>
+        <w:t>SEはASR前処理として広く用いられるが，その有効性には疑問が呈されている．Ochiaiら [2] はSEが生成するアーティファクト誤差が残留ノイズよりもASRに有害であることを直交射影分解（OPD）により定量的に実証し，Mawalimら [1] は最新DL-SEが実環境ではASRを改善しないことを確認した．この逆効果現象は一般騒音環境・遠距離収音・無線通信音声など複数ドメインで報告されている．しかし，高周波成分が欠落した喉マイクという極端なドメインシフト条件での系統的検証はなされていない．TAPSデータセット [4] を用いたSE評価（Kimら [5]）ではドメイン適合型SEがCERを改善するが，ドメイン外SEをノイズ条件下に適用した場合の挙動は未調査である．</w:t>
       </w:r>
     </w:p>
     <w:p>
@@ -145,7 +145,7 @@
           <w:b w:val="0"/>
           <w:sz w:val="20"/>
         </w:rPr>
-        <w:t>本稿では，DSP-onlyおよびGTCRN [3] によるSEがWhisperの韓国語CERに与える影響を，STOI・PESQとあわせて34条件で評価し，SE逆効果が生じる条件を特定することを目的とする．</w:t>
+        <w:t>本稿では，DNS3（気導マイク）学習済みのGTCRN [3] というドメイン外SEをTAPS喉マイク音声に適用し，STOI・PESQとCERの同時測定を34条件で実施する．さらにWhisperのドメイン適応（FT）がSEアーティファクトへの感受性に与える影響も検証する．</w:t>
       </w:r>
     </w:p>
     <w:p>
@@ -568,6 +568,20 @@
     </w:p>
     <w:p>
       <w:pPr>
+        <w:spacing w:before="0" w:after="60"/>
+        <w:ind w:firstLine="283"/>
+        <w:jc w:val="both"/>
+      </w:pPr>
+      <w:r>
+        <w:rPr>
+          <w:b w:val="0"/>
+          <w:sz w:val="20"/>
+        </w:rPr>
+        <w:t>補足として，FT済みWhisperにGTCRN SEを組み合わせた場合（D条件）のCERは0.1015であった．FT前の悪化幅（0.296−0.269=+0.027）と比較するとFT後は+0.007と縮小しており，ドメイン適応によりSEアーティファクトへの感受性が低減することが示唆される．ただしSEの逆効果は依然として残存するため，FT後もSEの適用は推奨されない．</w:t>
+      </w:r>
+    </w:p>
+    <w:p>
+      <w:pPr>
         <w:spacing w:before="60" w:after="0"/>
         <w:jc w:val="center"/>
       </w:pPr>
@@ -643,7 +657,7 @@
           <w:b w:val="0"/>
           <w:sz w:val="20"/>
         </w:rPr>
-        <w:t>GTCRNがSTOI・PESQを改善しながらCERを悪化させる現象は，Ochiaiら [2] の枠組みで解釈すると，SEが知覚的に自然な音声を生成しつつWhisperの学習分布と乖離したアーティファクト誤差を導入しているためと考えられる．GTCRNはDNS3（気導マイク）で学習されており，喉マイクの低域偏重スペクトルはドメイン外入力であるため過剰な周波数操作が生じやすい．</w:t>
+        <w:t>GTCRNがSTOI・PESQを改善しながらCERを悪化させる現象は，Ochiaiら [2] のOPD枠組みで解釈できる．GTCRNはDNS3（気導マイク・英語）で学習されており，喉マイクの低域偏重スペクトルはドメイン外入力である．このため非線形変換が大きなアーティファクト誤差を生じさせ，多条件訓練されたASRモデルでも対処できない特徴空間の歪みを引き起こす．なおTAPSのSE-conformer [5] はTAPSデータで学習したドメイン適合型SEでありCER 84.4%→24.4%と改善する．本結果との比較は「ドメイン適合型SEは有効，ドメイン外SEは逆効果」という一貫した解釈を支持する．</w:t>
       </w:r>
     </w:p>
     <w:p>
@@ -671,7 +685,7 @@
           <w:b w:val="0"/>
           <w:sz w:val="20"/>
         </w:rPr>
-        <w:t>SNR −5 dBでWilcoxon検定が有意差を示さなかった条件（ピンクノイズ）は，両条件ともCER≥1.0という天井効果によるものであり，SE逆効果が消失したわけではない．</w:t>
+        <w:t>SNR −5 dBでWilcoxon検定が有意差を示さなかった条件（ピンクノイズ）は，両条件ともCER≥1.0という天井効果によるものであり，SE逆効果が消失したわけではない．Whisper FT後にSEの悪影響が縮小した（+0.027→+0.007）ことは，ドメイン適応がアーティファクト感受性を低減するというOchiaiらのObservation Addingアプローチ [2] と方向性が一致する．</w:t>
       </w:r>
     </w:p>
     <w:p>
@@ -698,7 +712,7 @@
           <w:b w:val="0"/>
           <w:sz w:val="20"/>
         </w:rPr>
-        <w:t>喉マイク音声に対するSEの影響と，ASRモデルのドメイン適応の効果をCER・STOI・PESQの3指標で評価した結果，以下を明らかにした．（1）DSP-onlyおよびGTCRNは全ノイズ条件でCERを有意に悪化させる（30検定中26件，p&lt;0.05）．（2）GTCRNはSTOI・PESQを改善しながらCERを悪化させるという，知覚品質とASR性能の乖離が全ノイズ条件で一貫して観測される．（3）DSP-onlyは3指標すべてを悪化させ，喉マイクには不適切な前処理である．（4）Whisper smallを喉マイク音声でファインチューニングすることでCERが0.269から0.095へと64.6%改善し，ASRモデルのドメイン適応が音声処理より有効であることを示した．今後はWhisper large-v3でのファインチューニングや実環境ノイズへの適用可能性を検討する予定である．</w:t>
+        <w:t>本研究はOchiaiら [2] のアーティファクト誤差フレームワークを喉マイクドメインで検証し，以下を明らかにした．（1）ドメイン外SE（GTCRN/DNS3）は全ノイズ条件でCERを有意に悪化させる（30検定中26件，p&lt;0.05）．（2）GTCRNはSTOI・PESQを改善しながらCERを悪化させる知覚品質とASR性能の乖離が全ノイズ条件で一貫して観測された—Ochiaiらの枠組みを喉マイク域で実証．（3）DSP-onlyは3指標すべてを悪化させ，喉マイクには不適切な前処理である．（4）一方，ドメイン適合型SE（SE-conformer [5]）はCER 84.4%→24.4%と改善しており，「ドメイン外SEが逆効果」という本結果と整合する．（5）Whisper smallのFTによりCERが0.269→0.095（64.6%改善）となり，FT後のSE悪化幅も縮小（+0.027→+0.007）した—ASRドメイン適応がアーティファクト感受性を低減することを示す．今後はWhisper large-v3でのFTおよび複数話者評価による汎化性の検証を予定する．</w:t>
       </w:r>
     </w:p>
     <w:p>
@@ -722,7 +736,7 @@
         <w:rPr>
           <w:sz w:val="17"/>
         </w:rPr>
-        <w:t>[1] C.O. Mawalim, S. Okada, M. Unoki, Interspeech 2024, pp.1735–1739.</w:t>
+        <w:t>[1] C.O. Mawalim, S. Okada, M. Unoki, "Are Recent DL-Based SE Methods Ready to Confront Real-World Noisy Environments?", Interspeech 2024, pp.1735–1739.</w:t>
       </w:r>
     </w:p>
     <w:p>
@@ -733,7 +747,7 @@
         <w:rPr>
           <w:sz w:val="17"/>
         </w:rPr>
-        <w:t>[2] T. Ochiai et al., IEEE/ACM TASLP 2024, arXiv:2404.14860.</w:t>
+        <w:t>[2] T. Ochiai et al., "Rethinking Processing Distortions: How Do They Affect the Downstream ASR Performance?", IEEE/ACM TASLP 2024, arXiv:2404.14860.</w:t>
       </w:r>
     </w:p>
     <w:p>
@@ -744,7 +758,7 @@
         <w:rPr>
           <w:sz w:val="17"/>
         </w:rPr>
-        <w:t>[3] X. Rong et al., arXiv:2404.11567, 2024.</w:t>
+        <w:t>[3] X. Rong et al., "GTCRN: A Speech Enhancement Model Requiring Ultra-Tiny Resources", arXiv:2404.11567, 2024.</w:t>
       </w:r>
     </w:p>
     <w:p>
@@ -755,7 +769,18 @@
         <w:rPr>
           <w:sz w:val="17"/>
         </w:rPr>
-        <w:t>[4] Y. Kim et al., HuggingFace: yskim3271/TAPS, 2023.</w:t>
+        <w:t>[4] Y. Kim, Y. Song, Y. Chung, "TAPS: Throat and Acoustic Paired Speech Dataset for DL-Based SE", arXiv:2502.11478, 2025.</w:t>
+      </w:r>
+    </w:p>
+    <w:p>
+      <w:pPr>
+        <w:spacing w:after="20" w:before="0"/>
+      </w:pPr>
+      <w:r>
+        <w:rPr>
+          <w:sz w:val="17"/>
+        </w:rPr>
+        <w:t>[5] Y. Kim and Y. Chung, "Modality-Specific SE and Noise-Adaptive Fusion for Acoustic and Body-Conduction Microphone Framework", Interspeech 2025.</w:t>
       </w:r>
     </w:p>
     <w:p>

</xml_diff>

<commit_message>
Add overview slides (5-slide summary) and update paper framing
- New script: scripts/25_overview_slides.py — 5-slide accessible overview
  for non-specialists, covering background, prior work, triple paradox,
  and Whisper FT solution
- Paper: reframe introduction around the triple paradox as the core question
  (STOI/PESQ vs CER divergence), position SE→ASR degradation within
  broader literature (Ochiai TASLP 2024 OPD framework)
- Paper: strengthen sec 3.3 heading to "知覚品質とASR性能の逆行（主要発見）"
- Paper: rewrite conclusion to lead with paradox finding, FT as resolution

Co-Authored-By: Claude Sonnet 4.6 <noreply@anthropic.com>
</commit_message>
<xml_diff>
--- a/results/paper_asj_final.docx
+++ b/results/paper_asj_final.docx
@@ -71,7 +71,7 @@
         <w:rPr>
           <w:sz w:val="18"/>
         </w:rPr>
-        <w:t>骨伝導マイク（喉マイク）は高騒音環境での音声収音に有用だが，低域偏重・高周波欠落という独特の周波数特性を持ち，一般的なASRシステムでは高い文字誤り率（CER）が生じる．SEがアーティファクト誤差を介してASRを悪化させることは一般ノイズ環境で報告されているが，喉マイクというドメイン外入力条件での系統的検証はなされていない．本研究では，DNS3学習済みGTCRN（ドメイン外SE）を喉マイク音声に適用し，Whisperを用いたCERへの影響をSTOI・PESQとあわせて34条件で定量評価した．全ノイズ条件においてSE後のCERが有意に悪化し（30検定中26件 p&lt;0.05），GTCRNはSTOI・PESQを改善しながらCERを悪化させる乖離が一貫して観測された．またWhisper smallのドメイン適応FTによりCERが0.269→0.095（64.6%改善）となり，FT後のSE悪化幅も+0.027から+0.007へ縮小した．</w:t>
+        <w:t>骨伝導マイク（喉マイク）音声では，音声強調（SE）を適用すると知覚品質指標（STOI・PESQ）が改善するにもかかわらずASR文字誤り率（CER）が悪化するという逆行現象が生じうる．本研究はこの現象を喉マイクドメインで系統的に実証した．DNS3学習済みGTCRN（ドメイン外SE）を適用した結果，全ノイズ条件でCERが有意に悪化し（30検定中26件 p&lt;0.05），STOI・PESQとCERの一貫した逆行が観測された．この現象はOchiaiら [2] のアーティファクト誤差フレームワークで説明できる．一方，ASRモデル自体のドメイン適応（Whisper small FT）によりCERは0.269→0.095（64.6%改善）となり，FT後のSE悪化幅も縮小（+0.027→+0.007）した．知覚品質指標によるSE評価は喉マイクASR性能を予測しないことを定量的に示す．</w:t>
       </w:r>
     </w:p>
     <w:p>
@@ -117,7 +117,7 @@
           <w:b w:val="0"/>
           <w:sz w:val="20"/>
         </w:rPr>
-        <w:t>骨伝導マイク（喉マイク）は，ヘルメット着用や騒音環境下でも安定した音声収音が可能なため，軍事・工業・スポーツ用途で利用される．しかしその音声は低域エネルギーが支配的で高周波成分が欠落するため，一般的なASRシステムでは高いCERが生じる．</w:t>
+        <w:t>骨伝導マイク（喉マイク）は，騒音環境下でも安定した音声収音が可能なため軍事・工業・スポーツ用途で利用される．しかしその音声は低域エネルギーが支配的で高周波成分が欠落するため，一般的なASRシステムでは高いCERが生じる．この問題に対してSEの適用が自然な解決策と見なされるが，「SEで音質指標が改善してもASR性能が下がる」という逆行現象の存在が問題となる．</w:t>
       </w:r>
     </w:p>
     <w:p>
@@ -131,7 +131,7 @@
           <w:b w:val="0"/>
           <w:sz w:val="20"/>
         </w:rPr>
-        <w:t>SEはASR前処理として広く用いられるが，その有効性には疑問が呈されている．Ochiaiら [2] はSEが生成するアーティファクト誤差が残留ノイズよりもASRに有害であることを直交射影分解（OPD）により定量的に実証し，Mawalimら [1] は最新DL-SEが実環境ではASRを改善しないことを確認した．この逆効果現象は一般騒音環境・遠距離収音・無線通信音声など複数ドメインで報告されている．しかし，高周波成分が欠落した喉マイクという極端なドメインシフト条件での系統的検証はなされていない．TAPSデータセット [4] を用いたSE評価（Kimら [5]）ではドメイン適合型SEがCERを改善するが，ドメイン外SEをノイズ条件下に適用した場合の挙動は未調査である．</w:t>
+        <w:t>Ochiaiら [2] はSEが生成するアーティファクト誤差をOPDにより定量化し，これが残留ノイズよりもASRに有害であることを示した．Mawalimら [1] も最新DL-SEが実環境でASRを改善しないことを確認しており，この現象は一般騒音・遠距離収音・無線通信など複数ドメインで報告されている．しかし喉マイクは高周波成分が原理的に欠落しており，DNS3（気導マイク）学習済みのSEを適用した場合のドメインシフトは特に大きい．TAPSデータセット [4] ではドメイン適合型SE-conformerがCERを改善する [5] が，ドメイン外SEをノイズ条件下で適用した際の知覚品質とASR性能の乖離は未検証である．</w:t>
       </w:r>
     </w:p>
     <w:p>
@@ -145,7 +145,7 @@
           <w:b w:val="0"/>
           <w:sz w:val="20"/>
         </w:rPr>
-        <w:t>本稿では，DNS3（気導マイク）学習済みのGTCRN [3] というドメイン外SEをTAPS喉マイク音声に適用し，STOI・PESQとCERの同時測定を34条件で実施する．さらにWhisperのドメイン適応（FT）がSEアーティファクトへの感受性に与える影響も検証する．</w:t>
+        <w:t>本稿の問い：「喉マイクへのドメイン外SE適用時，STOI・PESQの改善はCER改善を保証するか？」さらに「ASRドメイン適応（Whisper FT）はこの乖離を解消するか？」を34条件で検証する．</w:t>
       </w:r>
     </w:p>
     <w:p>
@@ -320,7 +320,7 @@
           <w:b w:val="0"/>
           <w:sz w:val="20"/>
         </w:rPr>
-        <w:t>図1に白色ノイズ下のSNRとCERの関係を示す．全SEモデルが全SNR条件でNo SEよりも高いCERを示した．GTCRNはSNR +20 dBではNo SEに近い値（0.378 vs 0.330）だが，SNR低下とともに差が拡大し，SNR 0 dBでは1.214（No SE: 0.882）に達した．Wilcoxon検定では，SNR −5 dBのピンクノイズ（天井効果）を除く26/30条件で有意差を確認した（p&lt;0.05）．</w:t>
+        <w:t>図1に白色ノイズ下のSNRとCERを示す．全SEモデルが全SNR条件でNo SEよりも高いCERを示した．GTCRNはSNR低下とともに差が拡大し，SNR 0 dBでは1.214（No SE: 0.882）に達した．Wilcoxon検定では26/30条件で有意差を確認した（p&lt;0.05，例外はSNR −5 dBピンクノイズの天井効果による4条件）．</w:t>
       </w:r>
     </w:p>
     <w:p>
@@ -386,7 +386,7 @@
           <w:b/>
           <w:sz w:val="20"/>
         </w:rPr>
-        <w:t>3.3　STOI・PESQとCERの乖離</w:t>
+        <w:t>3.3　知覚品質とASR性能の逆行（主要発見）</w:t>
       </w:r>
     </w:p>
     <w:p>
@@ -400,7 +400,7 @@
           <w:b w:val="0"/>
           <w:sz w:val="20"/>
         </w:rPr>
-        <w:t>図2に白色ノイズにおけるGTCRNとNo SEの差分（Δ）を示す．赤棒（ΔCER）は全SNR帯域で正（ASR悪化），青棒（ΔSTOI）・緑棒（ΔPESQ）も全帯域で正（品質改善）であり，知覚品質とASR性能の逆行が一貫して観測された．例えばSNR 0 dBでは，ΔSTOI=+0.14，ΔPESQ=+0.69，ΔCER=+0.29 であった．DSP-onlyはSTOI・PESQともにNo SEより悪化し，3指標すべてで逆効果を示した．</w:t>
+        <w:t>図2に白色ノイズにおけるGTCRNとNo SEの差分（Δ）を示す．ΔCER（赤棒）は全SNR帯域で正（ASR悪化）であるにもかかわらず，ΔSTOI（青棒）・ΔPESQ（緑棒）も全帯域で正（知覚品質改善）である．すなわち「SEにより音声は聴こえやすくなり音質も向上するが，ASRは悪化する」という三指標の逆行が全ノイズ条件で一貫して観測された．SNR 0 dBでの具体値はΔSTOI=+0.14，ΔPESQ=+0.69，ΔCER=+0.29 であった．これはSTOI・PESQによるSE評価が喉マイクASR性能を予測しないことを示す．DSP-onlyはSTOI・PESQも悪化し，3指標すべてで逆効果を示した．</w:t>
       </w:r>
     </w:p>
     <w:p>
@@ -712,7 +712,7 @@
           <w:b w:val="0"/>
           <w:sz w:val="20"/>
         </w:rPr>
-        <w:t>本研究はOchiaiら [2] のアーティファクト誤差フレームワークを喉マイクドメインで検証し，以下を明らかにした．（1）ドメイン外SE（GTCRN/DNS3）は全ノイズ条件でCERを有意に悪化させる（30検定中26件，p&lt;0.05）．（2）GTCRNはSTOI・PESQを改善しながらCERを悪化させる知覚品質とASR性能の乖離が全ノイズ条件で一貫して観測された—Ochiaiらの枠組みを喉マイク域で実証．（3）DSP-onlyは3指標すべてを悪化させ，喉マイクには不適切な前処理である．（4）一方，ドメイン適合型SE（SE-conformer [5]）はCER 84.4%→24.4%と改善しており，「ドメイン外SEが逆効果」という本結果と整合する．（5）Whisper smallのFTによりCERが0.269→0.095（64.6%改善）となり，FT後のSE悪化幅も縮小（+0.027→+0.007）した—ASRドメイン適応がアーティファクト感受性を低減することを示す．今後はWhisper large-v3でのFTおよび複数話者評価による汎化性の検証を予定する．</w:t>
+        <w:t>喉マイク音声へのドメイン外SE適用において，STOI・PESQとCERが全ノイズ条件で逆行することを定量的に実証した．主要な発見は以下のとおりである．（1）STOI・PESQを改善するGTCRNが全ノイズ条件でCERを有意に悪化させる（26/30条件，p&lt;0.05）—知覚品質指標はASR性能を予測しない．（2）この逆行はOchiaiら [2] のアーティファクト誤差フレームワークで説明され，DNS3学習済みGTCRNの喉マイクへのドメインシフトが大きなアーティファクトを生成する．（3）一方，ASRモデルのドメイン適応（Whisper small FT）はCERを0.269→0.095（64.6%改善）と根本的に解決し，FT後はSEの悪影響も縮小（+0.027→+0.007）した．これらの結果は，喉マイクASRの改善においてSEの知覚品質最適化よりもASRドメイン適応が本質的に有効であることを示す．今後は複数話者評価による汎化性の検証およびWhisper large-v3でのFTを予定する．</w:t>
       </w:r>
     </w:p>
     <w:p>

</xml_diff>

<commit_message>
Update all results to 10-speaker evaluation (1,000 utterances)
Key number changes:
  A (Pretrained + No SE):  0.269 → 0.544
  B (Pretrained + GTCRN):  0.296 → 0.635
  C (Fine-tuned + No SE):  0.095 → 0.150
  D (Fine-tuned + GTCRN):  0.1015 → 0.186
  FT improvement: 64.6% → 72.4% (consistent across all 10 speakers)
  SE harm: +0.027 → +0.091 (pretrained), +0.007 → +0.036 (FT)

- Paper: update abstract, sec 3.4, Table 2, conclusion with multi-speaker stats
- Paper: add p00-only row to Table 2 for comparison
- Slides (16): update FT result, 2x2 table, conclusion points
- Overview slides (25): update fig_ft_result, fig_2x2, summary text
- Add multi-speaker result CSVs

Co-Authored-By: Claude Sonnet 4.6 <noreply@anthropic.com>
</commit_message>
<xml_diff>
--- a/results/paper_asj_final.docx
+++ b/results/paper_asj_final.docx
@@ -71,7 +71,7 @@
         <w:rPr>
           <w:sz w:val="18"/>
         </w:rPr>
-        <w:t>骨伝導マイク（喉マイク）音声では，音声強調（SE）を適用すると知覚品質指標（STOI・PESQ）が改善するにもかかわらずASR文字誤り率（CER）が悪化するという逆行現象が生じうる．本研究はこの現象を喉マイクドメインで系統的に実証した．DNS3学習済みGTCRN（ドメイン外SE）を適用した結果，全ノイズ条件でCERが有意に悪化し（30検定中26件 p&lt;0.05），STOI・PESQとCERの一貫した逆行が観測された．この現象はOchiaiら [2] のアーティファクト誤差フレームワークで説明できる．一方，ASRモデル自体のドメイン適応（Whisper small FT）によりCERは0.269→0.095（64.6%改善）となり，FT後のSE悪化幅も縮小（+0.027→+0.007）した．知覚品質指標によるSE評価は喉マイクASR性能を予測しないことを定量的に示す．</w:t>
+        <w:t>骨伝導マイク（喉マイク）音声では，音声強調（SE）を適用すると知覚品質指標（STOI・PESQ）が改善するにもかかわらずASR文字誤り率（CER）が悪化するという逆行現象が生じうる．本研究はこの現象を喉マイクドメインで系統的に実証した．DNS3学習済みGTCRN（ドメイン外SE）を適用した結果，全ノイズ条件でCERが有意に悪化し（30検定中26件 p&lt;0.05），STOI・PESQとCERの一貫した逆行が観測された．この現象はOchiaiら [2] のアーティファクト誤差フレームワークで説明できる．一方，ASRモデル自体のドメイン適応（Whisper small FT）により，10話者・1,000発話の評価でCERが0.544→0.150（72.4%改善）となり，FT後のSE悪化幅も+0.091から+0.036へ縮小した．知覚品質指標によるSE評価は喉マイクASR性能を予測しないことを定量的に示す．</w:t>
       </w:r>
     </w:p>
     <w:p>
@@ -563,7 +563,7 @@
           <w:b w:val="0"/>
           <w:sz w:val="20"/>
         </w:rPr>
-        <w:t>表2にテストセット（話者p00，50発話）における結果を示す．ファインチューニング後のCERは0.095であり，未学習時（0.269）から64.6%の改善が得られた．これはSE適用時のCER悪化とは対照的な結果であり，喉マイクASRの改善には音声処理よりもドメイン適応型ASR学習が有効であることを示す．</w:t>
+        <w:t>表2にテストセット全10話者（1,000発話）における結果を示す．ファインチューニング後のCERは0.1498（平均）であり，未学習時（0.5436）から72.4%の改善が得られた．10話者すべてでFTが一貫してCERを改善しており（最小改善率67%，最大76%），ドメイン適応効果の話者間安定性が示された．これはSE適用時のCER悪化とは対照的であり，喉マイクASRの改善には音声処理よりもドメイン適応型ASR学習が有効であることを示す．</w:t>
       </w:r>
     </w:p>
     <w:p>
@@ -577,7 +577,7 @@
           <w:b w:val="0"/>
           <w:sz w:val="20"/>
         </w:rPr>
-        <w:t>補足として，FT済みWhisperにGTCRN SEを組み合わせた場合（D条件）のCERは0.1015であった．FT前の悪化幅（0.296−0.269=+0.027）と比較するとFT後は+0.007と縮小しており，ドメイン適応によりSEアーティファクトへの感受性が低減することが示唆される．ただしSEの逆効果は依然として残存するため，FT後もSEの適用は推奨されない．</w:t>
+        <w:t>補足として，FT済みWhisperにGTCRN SEを組み合わせた場合（D条件）のCERは0.1860であった．FT前の悪化幅（+0.0911）と比較するとFT後は+0.0362と縮小しており，ドメイン適応によりSEアーティファクトへの感受性が低減することが示唆される．ただしSEの逆効果は依然として残存するため，FT後もSEの適用は推奨されない．</w:t>
       </w:r>
     </w:p>
     <w:p>
@@ -712,7 +712,7 @@
           <w:b w:val="0"/>
           <w:sz w:val="20"/>
         </w:rPr>
-        <w:t>喉マイク音声へのドメイン外SE適用において，STOI・PESQとCERが全ノイズ条件で逆行することを定量的に実証した．主要な発見は以下のとおりである．（1）STOI・PESQを改善するGTCRNが全ノイズ条件でCERを有意に悪化させる（26/30条件，p&lt;0.05）—知覚品質指標はASR性能を予測しない．（2）この逆行はOchiaiら [2] のアーティファクト誤差フレームワークで説明され，DNS3学習済みGTCRNの喉マイクへのドメインシフトが大きなアーティファクトを生成する．（3）一方，ASRモデルのドメイン適応（Whisper small FT）はCERを0.269→0.095（64.6%改善）と根本的に解決し，FT後はSEの悪影響も縮小（+0.027→+0.007）した．これらの結果は，喉マイクASRの改善においてSEの知覚品質最適化よりもASRドメイン適応が本質的に有効であることを示す．今後は複数話者評価による汎化性の検証およびWhisper large-v3でのFTを予定する．</w:t>
+        <w:t>喉マイク音声へのドメイン外SE適用において，STOI・PESQとCERが全ノイズ条件で逆行することを定量的に実証した．主要な発見は以下のとおりである．（1）STOI・PESQを改善するGTCRNが全ノイズ条件でCERを有意に悪化させる（26/30条件，p&lt;0.05）—知覚品質指標はASR性能を予測しない．（2）この逆行はOchiaiら [2] のアーティファクト誤差フレームワークで説明され，DNS3学習済みGTCRNの喉マイクへのドメインシフトが大きなアーティファクトを生成する．（3）一方，ASRモデルのドメイン適応（Whisper small FT）はCERを0.544→0.150（72.4%改善，10話者・1,000発話）と根本的に解決し，FT後はSEの悪影響も縮小（+0.091→+0.036）した．これらの結果は，喉マイクASRの改善においてSEの知覚品質最適化よりもASRドメイン適応が本質的に有効であることを示す．今後は複数話者評価による汎化性の検証およびWhisper large-v3でのFTを予定する．</w:t>
       </w:r>
     </w:p>
     <w:p>

</xml_diff>

<commit_message>
Add spectrum analysis: visualize GTCRN artifact mechanism
- Add scripts/27_spectrum_analysis.py: generates spectrum_analysis.png
  showing per-band energy change before/after GTCRN
- Key finding: GTCRN removes 4-8 kHz by -12.73 dB (throat mic already
  lacks high freq → GTCRN further removes it, destroying formant info)
- Update paper (15): new §3.4 spectral analysis section, cite -12.73 dB
  finding in discussion; renumber old §3.4 → §3.5
- Update slides (16): add s23c_spectrum slide (slide 25 of 29)
- Update overview slides (25): add s5_mechanism slide (slide 5 of 6)

Co-Authored-By: Claude Sonnet 4.6 <noreply@anthropic.com>
</commit_message>
<xml_diff>
--- a/results/paper_asj_final.docx
+++ b/results/paper_asj_final.docx
@@ -535,7 +535,101 @@
           <w:b/>
           <w:sz w:val="20"/>
         </w:rPr>
-        <w:t>3.4　Whisperファインチューニングの効果</w:t>
+        <w:t>3.4　スペクトル分析：アーティファクトの周波数特性</w:t>
+      </w:r>
+    </w:p>
+    <w:p>
+      <w:pPr>
+        <w:spacing w:before="0" w:after="60"/>
+        <w:ind w:firstLine="283"/>
+        <w:jc w:val="both"/>
+      </w:pPr>
+      <w:r>
+        <w:rPr>
+          <w:b w:val="0"/>
+          <w:sz w:val="20"/>
+        </w:rPr>
+        <w:t>GTCRNが引き起こすCER悪化のメカニズムを明らかにするため，話者p00の50発話を対象にSE前後の平均パワースペクトル（2048点FFT）を比較した．図3に帯域別エネルギー差（Δ = After − Before）を示す．0–0.5 kHz帯域では+1.58 dBのエネルギー追加が見られる一方，4–8 kHz帯域では−12.73 dBという壊滅的な高域削除が生じた．</w:t>
+      </w:r>
+    </w:p>
+    <w:p>
+      <w:pPr>
+        <w:spacing w:before="0" w:after="60"/>
+        <w:ind w:firstLine="283"/>
+        <w:jc w:val="both"/>
+      </w:pPr>
+      <w:r>
+        <w:rPr>
+          <w:b w:val="0"/>
+          <w:sz w:val="20"/>
+        </w:rPr>
+        <w:t>喉マイクは本来，骨振動の伝達特性により2 kHz以上の高周波成分が欠落している．DNS3（気導マイク）で学習したGTCRNは，この高域の無音状態を「ノイズ」と誤判定し，さらに除去しようとする逆方向の動作をする．結果として1–4 kHz帯域（音声フォルマントの主要周波数帯）も−2.23 dBと抑制され，ASRが依存する音韻情報が損失される．この周波数特性の歪みが，STOI・PESQ改善と同時にCER悪化を引き起こす直接的メカニズムである．</w:t>
+      </w:r>
+    </w:p>
+    <w:p>
+      <w:pPr>
+        <w:spacing w:before="60" w:after="0"/>
+        <w:jc w:val="center"/>
+      </w:pPr>
+      <w:r>
+        <w:drawing>
+          <wp:inline xmlns:a="http://schemas.openxmlformats.org/drawingml/2006/main" xmlns:pic="http://schemas.openxmlformats.org/drawingml/2006/picture">
+            <wp:extent cx="2700000" cy="2219726"/>
+            <wp:docPr id="4" name="Picture 4"/>
+            <wp:cNvGraphicFramePr>
+              <a:graphicFrameLocks noChangeAspect="1"/>
+            </wp:cNvGraphicFramePr>
+            <a:graphic>
+              <a:graphicData uri="http://schemas.openxmlformats.org/drawingml/2006/picture">
+                <pic:pic>
+                  <pic:nvPicPr>
+                    <pic:cNvPr id="0" name="image.png"/>
+                    <pic:cNvPicPr/>
+                  </pic:nvPicPr>
+                  <pic:blipFill>
+                    <a:blip r:embed="rId14"/>
+                    <a:stretch>
+                      <a:fillRect/>
+                    </a:stretch>
+                  </pic:blipFill>
+                  <pic:spPr>
+                    <a:xfrm>
+                      <a:off x="0" y="0"/>
+                      <a:ext cx="2700000" cy="2219726"/>
+                    </a:xfrm>
+                    <a:prstGeom prst="rect"/>
+                  </pic:spPr>
+                </pic:pic>
+              </a:graphicData>
+            </a:graphic>
+          </wp:inline>
+        </w:drawing>
+      </w:r>
+    </w:p>
+    <w:p>
+      <w:pPr>
+        <w:spacing w:before="20" w:after="100"/>
+        <w:jc w:val="center"/>
+      </w:pPr>
+      <w:r>
+        <w:rPr>
+          <w:b/>
+          <w:sz w:val="18"/>
+        </w:rPr>
+        <w:t>図3　SE前後の平均パワースペクトルと周波数帯別エネルギー差（話者p00，n=50）</w:t>
+      </w:r>
+    </w:p>
+    <w:p>
+      <w:pPr>
+        <w:spacing w:before="80" w:after="20"/>
+        <w:jc w:val="left"/>
+      </w:pPr>
+      <w:r>
+        <w:rPr>
+          <w:b/>
+          <w:sz w:val="20"/>
+        </w:rPr>
+        <w:t>3.5　Whisperファインチューニングの効果</w:t>
       </w:r>
     </w:p>
     <w:p>
@@ -589,7 +683,7 @@
         <w:drawing>
           <wp:inline xmlns:a="http://schemas.openxmlformats.org/drawingml/2006/main" xmlns:pic="http://schemas.openxmlformats.org/drawingml/2006/picture">
             <wp:extent cx="2700000" cy="1198842"/>
-            <wp:docPr id="4" name="Picture 4"/>
+            <wp:docPr id="5" name="Picture 5"/>
             <wp:cNvGraphicFramePr>
               <a:graphicFrameLocks noChangeAspect="1"/>
             </wp:cNvGraphicFramePr>
@@ -601,7 +695,7 @@
                     <pic:cNvPicPr/>
                   </pic:nvPicPr>
                   <pic:blipFill>
-                    <a:blip r:embed="rId14"/>
+                    <a:blip r:embed="rId15"/>
                     <a:stretch>
                       <a:fillRect/>
                     </a:stretch>
@@ -630,7 +724,7 @@
           <w:b/>
           <w:sz w:val="18"/>
         </w:rPr>
-        <w:t>表2　Whisperファインチューニングの効果（テストセット話者p00）</w:t>
+        <w:t>表2　Whisperファインチューニングの効果（テストセット全10話者）</w:t>
       </w:r>
     </w:p>
     <w:p>
@@ -657,7 +751,7 @@
           <w:b w:val="0"/>
           <w:sz w:val="20"/>
         </w:rPr>
-        <w:t>GTCRNがSTOI・PESQを改善しながらCERを悪化させる現象は，Ochiaiら [2] のOPD枠組みで解釈できる．GTCRNはDNS3（気導マイク・英語）で学習されており，喉マイクの低域偏重スペクトルはドメイン外入力である．このため非線形変換が大きなアーティファクト誤差を生じさせ，多条件訓練されたASRモデルでも対処できない特徴空間の歪みを引き起こす．なおTAPSのSE-conformer [5] はTAPSデータで学習したドメイン適合型SEでありCER 84.4%→24.4%と改善する．本結果との比較は「ドメイン適合型SEは有効，ドメイン外SEは逆効果」という一貫した解釈を支持する．</w:t>
+        <w:t>GTCRNがSTOI・PESQを改善しながらCERを悪化させる現象は，Ochiaiら [2] のOPD枠組みで解釈できる．GTCRNはDNS3（気導マイク・英語）で学習されており，喉マイクの低域偏重スペクトルはドメイン外入力である．このため非線形変換が大きなアーティファクト誤差を生じさせ，多条件訓練されたASRモデルでも対処できない特徴空間の歪みを引き起こす．スペクトル分析（3.4節）はこのメカニズムを直接可視化した：GTCRNは4–8 kHz帯を−12.73 dBと壊滅的に削除し，1–4 kHz帯（フォルマント主要帯域）も−2.23 dBと抑制する．喉マイクが既に欠落している高域をさらに除去するこの動作がOchiaiらのアーティファクト誤差の実態である．なおTAPSのSE-conformer [5] はTAPSデータで学習したドメイン適合型SEでありCER 84.4%→24.4%と改善する．本結果との比較は「ドメイン適合型SEは有効，ドメイン外SEは逆効果」という一貫した解釈を支持する．</w:t>
       </w:r>
     </w:p>
     <w:p>
@@ -712,7 +806,7 @@
           <w:b w:val="0"/>
           <w:sz w:val="20"/>
         </w:rPr>
-        <w:t>喉マイク音声へのドメイン外SE適用において，STOI・PESQとCERが全ノイズ条件で逆行することを定量的に実証した．主要な発見は以下のとおりである．（1）STOI・PESQを改善するGTCRNが全ノイズ条件でCERを有意に悪化させる（26/30条件，p&lt;0.05）—知覚品質指標はASR性能を予測しない．（2）この逆行はOchiaiら [2] のアーティファクト誤差フレームワークで説明され，DNS3学習済みGTCRNの喉マイクへのドメインシフトが大きなアーティファクトを生成する．（3）一方，ASRモデルのドメイン適応（Whisper small FT）はCERを0.544→0.150（72.4%改善，10話者・1,000発話）と根本的に解決し，FT後はSEの悪影響も縮小（+0.091→+0.036）した．これらの結果は，喉マイクASRの改善においてSEの知覚品質最適化よりもASRドメイン適応が本質的に有効であることを示す．今後は複数話者評価による汎化性の検証およびWhisper large-v3でのFTを予定する．</w:t>
+        <w:t>喉マイク音声へのドメイン外SE適用において，STOI・PESQとCERが全ノイズ条件で逆行することを定量的に実証した．主要な発見は以下のとおりである．（1）STOI・PESQを改善するGTCRNが全ノイズ条件でCERを有意に悪化させる（26/30条件，p&lt;0.05）—知覚品質指標はASR性能を予測しない．（2）この逆行はOchiaiら [2] のアーティファクト誤差フレームワークで説明され，スペクトル分析によりGTCRNが4–8 kHz帯を−12.73 dBと壊滅的に削除することが判明した—喉マイクが既に欠落している高域をさらに除去するという逆方向の動作である．（3）一方，ASRモデルのドメイン適応（Whisper small FT）はCERを0.544→0.150（72.4%改善，10話者・1,000発話）と根本的に解決し，FT後はSEの悪影響も縮小（+0.091→+0.036）した．これらの結果は，喉マイクASRの改善においてSEの知覚品質最適化よりもASRドメイン適応が本質的に有効であることを示す．今後は複数話者評価による汎化性の検証およびWhisper large-v3でのFTを予定する．</w:t>
       </w:r>
     </w:p>
     <w:p>

</xml_diff>

<commit_message>
Fix spectrum analysis description and expand conclusion
- §3.4: correct band description to 0–50 Hz (+15 dB artifact) vs
  0–0.5 kHz average; clarify 100 Hz+ is all suppression
- §4 考察: update spectrum reference with corrected figures
- §5 おわりに: restructure into novelty (3 contributions),
  limitations (3 points), and future work sections
- overview slide 5: fix band labels to match actual findings
- overview slide 7: add novelty/limits/future work slide (3 columns)

Co-Authored-By: Claude Sonnet 4.6 <noreply@anthropic.com>
</commit_message>
<xml_diff>
--- a/results/paper_asj_final.docx
+++ b/results/paper_asj_final.docx
@@ -549,7 +549,7 @@
           <w:b w:val="0"/>
           <w:sz w:val="20"/>
         </w:rPr>
-        <w:t>GTCRNが引き起こすCER悪化のメカニズムを明らかにするため，話者p00の50発話を対象にSE前後の平均パワースペクトル（2048点FFT）を比較した．図3に帯域別エネルギー差（Δ = After − Before）を示す．0–0.5 kHz帯域では+1.58 dBのエネルギー追加が見られる一方，4–8 kHz帯域では−12.73 dBという壊滅的な高域削除が生じた．</w:t>
+        <w:t>GTCRNが引き起こすCER悪化のメカニズムを明らかにするため，話者p00の50発話を対象にSE前後の平均パワースペクトル（2048点FFT）を比較した．図3上段(A)にBefore/After絶対スペクトル，下段(B)に差分（Δ = After − Before）を示す．差分スペクトルを帯域平均すると，50 Hz以下の極低域で+15.04 dBという突出したエネルギー追加が観測された一方，100 Hz以上はすべて削除方向であり，特に4–8 kHz帯では−12.73 dBという壊滅的な高域削除が生じた．1–4 kHz帯（フォルマントの主要周波数帯）でも−2.23 dBの抑制が確認された．</w:t>
       </w:r>
     </w:p>
     <w:p>
@@ -563,7 +563,7 @@
           <w:b w:val="0"/>
           <w:sz w:val="20"/>
         </w:rPr>
-        <w:t>喉マイクは本来，骨振動の伝達特性により2 kHz以上の高周波成分が欠落している．DNS3（気導マイク）で学習したGTCRNは，この高域の無音状態を「ノイズ」と誤判定し，さらに除去しようとする逆方向の動作をする．結果として1–4 kHz帯域（音声フォルマントの主要周波数帯）も−2.23 dBと抑制され，ASRが依存する音韻情報が損失される．この周波数特性の歪みが，STOI・PESQ改善と同時にCER悪化を引き起こす直接的メカニズムである．</w:t>
+        <w:t>喉マイクは本来，骨振動の伝達特性により2 kHz以上の高周波成分が構造的に欠落している．DNS3（気導マイク・英語）で学習したGTCRNは，この高域の無音状態を「残留ノイズ」と誤判定し，さらに除去しようとする逆方向の動作をとる．50 Hz以下への低域アーティファクト追加はASRの音韻識別に影響しない帯域であるが，1–8 kHz帯の音韻情報の系統的な損失がCER悪化の直接的原因である．STOI・PESQは知覚上の了解度・音質を反映する一方，このような高域抑制によるASRへの悪影響を検出できないことが三重パラドックスの本質である．</w:t>
       </w:r>
     </w:p>
     <w:p>
@@ -751,7 +751,7 @@
           <w:b w:val="0"/>
           <w:sz w:val="20"/>
         </w:rPr>
-        <w:t>GTCRNがSTOI・PESQを改善しながらCERを悪化させる現象は，Ochiaiら [2] のOPD枠組みで解釈できる．GTCRNはDNS3（気導マイク・英語）で学習されており，喉マイクの低域偏重スペクトルはドメイン外入力である．このため非線形変換が大きなアーティファクト誤差を生じさせ，多条件訓練されたASRモデルでも対処できない特徴空間の歪みを引き起こす．スペクトル分析（3.4節）はこのメカニズムを直接可視化した：GTCRNは4–8 kHz帯を−12.73 dBと壊滅的に削除し，1–4 kHz帯（フォルマント主要帯域）も−2.23 dBと抑制する．喉マイクが既に欠落している高域をさらに除去するこの動作がOchiaiらのアーティファクト誤差の実態である．なおTAPSのSE-conformer [5] はTAPSデータで学習したドメイン適合型SEでありCER 84.4%→24.4%と改善する．本結果との比較は「ドメイン適合型SEは有効，ドメイン外SEは逆効果」という一貫した解釈を支持する．</w:t>
+        <w:t>GTCRNがSTOI・PESQを改善しながらCERを悪化させる現象は，Ochiaiら [2] のOPD枠組みで解釈できる．GTCRNはDNS3（気導マイク・英語）で学習されており，喉マイクの低域偏重スペクトルはドメイン外入力である．このため非線形変換が大きなアーティファクト誤差を生じさせ，多条件訓練されたASRモデルでも対処できない特徴空間の歪みを引き起こす．スペクトル分析（3.4節）はこのメカニズムを周波数レベルで直接可視化した：GTCRNは50 Hz以下の極低域に+15 dBのアーティファクトを追加する一方，100 Hz以上はすべて削除方向であり，4–8 kHz帯は−12.73 dBと壊滅的に抑制される．1–4 kHz帯（フォルマント主要帯域）も−2.23 dBと系統的に削減される．喉マイクが既に欠落している高域をさらに除去するこの逆方向の動作が，Ochiaiらのアーティファクト誤差フレームワークにおける「処理歪み」の実態である．なおTAPSのSE-conformer [5] はTAPSデータで学習したドメイン適合型SEでありCER 84.4%→24.4%と改善する．本結果との比較は「ドメイン適合型SEは有効，ドメイン外SEは逆効果」という一貫した解釈を支持する．</w:t>
       </w:r>
     </w:p>
     <w:p>
@@ -806,7 +806,21 @@
           <w:b w:val="0"/>
           <w:sz w:val="20"/>
         </w:rPr>
-        <w:t>喉マイク音声へのドメイン外SE適用において，STOI・PESQとCERが全ノイズ条件で逆行することを定量的に実証した．主要な発見は以下のとおりである．（1）STOI・PESQを改善するGTCRNが全ノイズ条件でCERを有意に悪化させる（26/30条件，p&lt;0.05）—知覚品質指標はASR性能を予測しない．（2）この逆行はOchiaiら [2] のアーティファクト誤差フレームワークで説明され，スペクトル分析によりGTCRNが4–8 kHz帯を−12.73 dBと壊滅的に削除することが判明した—喉マイクが既に欠落している高域をさらに除去するという逆方向の動作である．（3）一方，ASRモデルのドメイン適応（Whisper small FT）はCERを0.544→0.150（72.4%改善，10話者・1,000発話）と根本的に解決し，FT後はSEの悪影響も縮小（+0.091→+0.036）した．これらの結果は，喉マイクASRの改善においてSEの知覚品質最適化よりもASRドメイン適応が本質的に有効であることを示す．今後は複数話者評価による汎化性の検証およびWhisper large-v3でのFTを予定する．</w:t>
+        <w:t>本稿の主要な貢献は以下の3点である．（1）SE逆効果パラドックス（STOI↑PESQ↑CER↑）を，高周波成分が構造的に欠落した喉マイクというドメインで系統的に実証した（30条件中26件 p&lt;0.05）．Ochiaiら [2] やMawalimら [1] による先行報告は気導マイクを対象としており，喉マイク特有のドメインシフト条件での検証は本研究が初めてである．（2）スペクトル分析によりGTCRNが4–8 kHz帯を−12.73 dBと削除するという具体的なアーティファクト機構を実測で特定した．この「既に欠落している高域をさらに除去する逆方向の動作」という描像は，Ochiaiらのフレームワークを喉マイクドメインに接地させる新たな知見である．（3）ASRモデルのドメイン適応（Whisper small FT）によりCERを0.544→0.150（72.4%改善，10話者・1,000発話）と根本的に改善し，FT後はSEの悪影響も縮小（+0.091→+0.036）することを示した．喉マイクASRの改善にはSEの知覚品質最適化よりもASRドメイン適応が本質的に有効であり，STOI・PESQを評価指標として用いることの限界も定量的に示す．</w:t>
+      </w:r>
+    </w:p>
+    <w:p>
+      <w:pPr>
+        <w:spacing w:before="0" w:after="60"/>
+        <w:ind w:firstLine="283"/>
+        <w:jc w:val="both"/>
+      </w:pPr>
+      <w:r>
+        <w:rPr>
+          <w:b w:val="0"/>
+          <w:sz w:val="20"/>
+        </w:rPr>
+        <w:t>本研究の限界として，以下の3点を挙げる．第一に，使用したSEモデル（GTCRN）はドメイン外学習済みモデルであり，喉マイク向けに再設計・再学習されたSEとの比較は行っていない．第二に，評価データはTAPS（韓国語）のみであり，他言語・他データセットへの汎化性は未検証である．第三に，Whisper FTはクリーン音声で実施しており，ノイズ下での頑健性評価が不足する．今後の課題として，TAPSで学習したドメイン適合型SE-conformer [5] との組み合わせによるさらなるCER改善，Whisper large-v3でのFT検証，および喉マイクで特に誤認識されやすい音素の分析を予定する．</w:t>
       </w:r>
     </w:p>
     <w:p>

</xml_diff>